<commit_message>
implemented E3 and E4
</commit_message>
<xml_diff>
--- a/docs/chunkwise-feasibility-report.docx
+++ b/docs/chunkwise-feasibility-report.docx
@@ -2108,12 +2108,7 @@
         </w:rPr>
       </w:pPr>
       <w:r>
-        <w:rPr>
-          <w:rFonts w:ascii="Times New Roman" w:hAnsi="Times New Roman" w:cs="Times New Roman"/>
-          <w:sz w:val="24"/>
-          <w:szCs w:val="24"/>
-        </w:rPr>
-        <w:t>A production service would need monitoring for deduplication ratio, bytes ingested, hashing CPU, index hit and miss rates and latency, chunk-store read and write latency, restore throughput, integrity failures, orphaned bytes, and garbage-collection backlog. Operators would need backup and restore procedures for both manifests and the index, key rotation, capacity forecasting, and a way to rebuild the index from durable metadata.</w:t>
+        <w:t>A production service would need monitoring for logical and physical bytes, deduplication ratio, hashing CPU, index latency and errors, chunk-store latency, restore throughput, integrity failures, orphaned bytes, and garbage-collection backlog. Operators would also need backup and restore procedures for the index and chunk data, capacity forecasting, and index-rebuild tooling. The current prototype exposes stats and verify commands, uses SQLite WAL, and commits file metadata and reference counts atomically. It does not provide structured logs, monitoring, index rebuild, backup automation, deletion, or garbage collection.</w:t>
       </w:r>
     </w:p>
     <w:p>
@@ -2126,12 +2121,7 @@
         </w:rPr>
       </w:pPr>
       <w:r>
-        <w:rPr>
-          <w:rFonts w:ascii="Times New Roman" w:hAnsi="Times New Roman" w:cs="Times New Roman"/>
-          <w:sz w:val="24"/>
-          <w:szCs w:val="24"/>
-        </w:rPr>
-        <w:t>For the prototype, operational needs are limited to logging the metrics above to structured logs, running the experiments from a script, and verifying that the index can be rebuilt from the stored manifests.</w:t>
+        <w:t>Prototype operation is limited to local put, get, verify, and stats commands plus the benchmark and Breakscale scripts. Restores verify every chunk and the whole-file size and checksum before the CLI publishes its temporary output. The writer is single-process; fsync is disabled by default. The core tests establish functional behavior, but they do not constitute crash or power-loss fault injection.</w:t>
       </w:r>
     </w:p>
     <w:p>
@@ -2371,21 +2361,8 @@
             <w:tcW w:w="2880" w:type="dxa"/>
           </w:tcPr>
           <w:p>
-            <w:pPr>
-              <w:spacing w:line="260" w:lineRule="auto"/>
-              <w:rPr>
-                <w:rFonts w:ascii="Times New Roman" w:hAnsi="Times New Roman" w:cs="Times New Roman"/>
-                <w:sz w:val="24"/>
-                <w:szCs w:val="24"/>
-              </w:rPr>
-            </w:pPr>
-            <w:r>
-              <w:rPr>
-                <w:rFonts w:ascii="Times New Roman" w:hAnsi="Times New Roman" w:cs="Times New Roman"/>
-                <w:sz w:val="24"/>
-                <w:szCs w:val="24"/>
-              </w:rPr>
-              <w:t>[value]</w:t>
+            <w:r>
+              <w:t>Pending: generated results/results.json is absent</w:t>
             </w:r>
           </w:p>
         </w:tc>
@@ -2394,21 +2371,8 @@
             <w:tcW w:w="2880" w:type="dxa"/>
           </w:tcPr>
           <w:p>
-            <w:pPr>
-              <w:spacing w:line="260" w:lineRule="auto"/>
-              <w:rPr>
-                <w:rFonts w:ascii="Times New Roman" w:hAnsi="Times New Roman" w:cs="Times New Roman"/>
-                <w:sz w:val="24"/>
-                <w:szCs w:val="24"/>
-              </w:rPr>
-            </w:pPr>
-            <w:r>
-              <w:rPr>
-                <w:rFonts w:ascii="Times New Roman" w:hAnsi="Times New Roman" w:cs="Times New Roman"/>
-                <w:sz w:val="24"/>
-                <w:szCs w:val="24"/>
-              </w:rPr>
-              <w:t>Prototype measurement</w:t>
+            <w:r>
+              <w:t>Owner A D1_random CDC benchmark; no local measurement</w:t>
             </w:r>
           </w:p>
         </w:tc>
@@ -2442,21 +2406,8 @@
             <w:tcW w:w="2880" w:type="dxa"/>
           </w:tcPr>
           <w:p>
-            <w:pPr>
-              <w:spacing w:line="260" w:lineRule="auto"/>
-              <w:rPr>
-                <w:rFonts w:ascii="Times New Roman" w:hAnsi="Times New Roman" w:cs="Times New Roman"/>
-                <w:sz w:val="24"/>
-                <w:szCs w:val="24"/>
-              </w:rPr>
-            </w:pPr>
-            <w:r>
-              <w:rPr>
-                <w:rFonts w:ascii="Times New Roman" w:hAnsi="Times New Roman" w:cs="Times New Roman"/>
-                <w:sz w:val="24"/>
-                <w:szCs w:val="24"/>
-              </w:rPr>
-              <w:t>[value]</w:t>
+            <w:r>
+              <w:t>Not measured by the current benchmark</w:t>
             </w:r>
           </w:p>
         </w:tc>
@@ -2465,21 +2416,8 @@
             <w:tcW w:w="2880" w:type="dxa"/>
           </w:tcPr>
           <w:p>
-            <w:pPr>
-              <w:spacing w:line="260" w:lineRule="auto"/>
-              <w:rPr>
-                <w:rFonts w:ascii="Times New Roman" w:hAnsi="Times New Roman" w:cs="Times New Roman"/>
-                <w:sz w:val="24"/>
-                <w:szCs w:val="24"/>
-              </w:rPr>
-            </w:pPr>
-            <w:r>
-              <w:rPr>
-                <w:rFonts w:ascii="Times New Roman" w:hAnsi="Times New Roman" w:cs="Times New Roman"/>
-                <w:sz w:val="24"/>
-                <w:szCs w:val="24"/>
-              </w:rPr>
-              <w:t>Prototype measurement</w:t>
+            <w:r>
+              <w:t>Index bytes per chunk are not captured by bench/run_bench.py</w:t>
             </w:r>
           </w:p>
         </w:tc>
@@ -2513,21 +2451,8 @@
             <w:tcW w:w="2880" w:type="dxa"/>
           </w:tcPr>
           <w:p>
-            <w:pPr>
-              <w:spacing w:line="260" w:lineRule="auto"/>
-              <w:rPr>
-                <w:rFonts w:ascii="Times New Roman" w:hAnsi="Times New Roman" w:cs="Times New Roman"/>
-                <w:sz w:val="24"/>
-                <w:szCs w:val="24"/>
-              </w:rPr>
-            </w:pPr>
-            <w:r>
-              <w:rPr>
-                <w:rFonts w:ascii="Times New Roman" w:hAnsi="Times New Roman" w:cs="Times New Roman"/>
-                <w:sz w:val="24"/>
-                <w:szCs w:val="24"/>
-              </w:rPr>
-              <w:t>[value]</w:t>
+            <w:r>
+              <w:t>Pending: generated results/results.json is absent</w:t>
             </w:r>
           </w:p>
         </w:tc>
@@ -2536,21 +2461,8 @@
             <w:tcW w:w="2880" w:type="dxa"/>
           </w:tcPr>
           <w:p>
-            <w:pPr>
-              <w:spacing w:line="260" w:lineRule="auto"/>
-              <w:rPr>
-                <w:rFonts w:ascii="Times New Roman" w:hAnsi="Times New Roman" w:cs="Times New Roman"/>
-                <w:sz w:val="24"/>
-                <w:szCs w:val="24"/>
-              </w:rPr>
-            </w:pPr>
-            <w:r>
-              <w:rPr>
-                <w:rFonts w:ascii="Times New Roman" w:hAnsi="Times New Roman" w:cs="Times New Roman"/>
-                <w:sz w:val="24"/>
-                <w:szCs w:val="24"/>
-              </w:rPr>
-              <w:t>Section 11 experiments</w:t>
+            <w:r>
+              <w:t>Owner A dataset benchmarks; no local measurement</w:t>
             </w:r>
           </w:p>
         </w:tc>
@@ -2584,21 +2496,8 @@
             <w:tcW w:w="2880" w:type="dxa"/>
           </w:tcPr>
           <w:p>
-            <w:pPr>
-              <w:spacing w:line="260" w:lineRule="auto"/>
-              <w:rPr>
-                <w:rFonts w:ascii="Times New Roman" w:hAnsi="Times New Roman" w:cs="Times New Roman"/>
-                <w:sz w:val="24"/>
-                <w:szCs w:val="24"/>
-              </w:rPr>
-            </w:pPr>
-            <w:r>
-              <w:rPr>
-                <w:rFonts w:ascii="Times New Roman" w:hAnsi="Times New Roman" w:cs="Times New Roman"/>
-                <w:sz w:val="24"/>
-                <w:szCs w:val="24"/>
-              </w:rPr>
-              <w:t>[value]</w:t>
+            <w:r>
+              <w:t>Not quantified; outside prototype scope</w:t>
             </w:r>
           </w:p>
         </w:tc>
@@ -2607,21 +2506,8 @@
             <w:tcW w:w="2880" w:type="dxa"/>
           </w:tcPr>
           <w:p>
-            <w:pPr>
-              <w:spacing w:line="260" w:lineRule="auto"/>
-              <w:rPr>
-                <w:rFonts w:ascii="Times New Roman" w:hAnsi="Times New Roman" w:cs="Times New Roman"/>
-                <w:sz w:val="24"/>
-                <w:szCs w:val="24"/>
-              </w:rPr>
-            </w:pPr>
-            <w:r>
-              <w:rPr>
-                <w:rFonts w:ascii="Times New Roman" w:hAnsi="Times New Roman" w:cs="Times New Roman"/>
-                <w:sz w:val="24"/>
-                <w:szCs w:val="24"/>
-              </w:rPr>
-              <w:t>Assumption, state explicitly</w:t>
+            <w:r>
+              <w:t>Production replication assumption, not a measured value</w:t>
             </w:r>
           </w:p>
         </w:tc>
@@ -2880,21 +2766,8 @@
             <w:tcW w:w="1600" w:type="dxa"/>
           </w:tcPr>
           <w:p>
-            <w:pPr>
-              <w:spacing w:line="260" w:lineRule="auto"/>
-              <w:rPr>
-                <w:rFonts w:ascii="Times New Roman" w:hAnsi="Times New Roman" w:cs="Times New Roman"/>
-                <w:sz w:val="24"/>
-                <w:szCs w:val="24"/>
-              </w:rPr>
-            </w:pPr>
-            <w:r>
-              <w:rPr>
-                <w:rFonts w:ascii="Times New Roman" w:hAnsi="Times New Roman" w:cs="Times New Roman"/>
-                <w:sz w:val="24"/>
-                <w:szCs w:val="24"/>
-              </w:rPr>
-              <w:t>[Name]</w:t>
+            <w:r>
+              <w:t>Owner A</w:t>
             </w:r>
           </w:p>
         </w:tc>
@@ -2903,21 +2776,8 @@
             <w:tcW w:w="1200" w:type="dxa"/>
           </w:tcPr>
           <w:p>
-            <w:pPr>
-              <w:spacing w:line="260" w:lineRule="auto"/>
-              <w:rPr>
-                <w:rFonts w:ascii="Times New Roman" w:hAnsi="Times New Roman" w:cs="Times New Roman"/>
-                <w:sz w:val="24"/>
-                <w:szCs w:val="24"/>
-              </w:rPr>
-            </w:pPr>
-            <w:r>
-              <w:rPr>
-                <w:rFonts w:ascii="Times New Roman" w:hAnsi="Times New Roman" w:cs="Times New Roman"/>
-                <w:sz w:val="24"/>
-                <w:szCs w:val="24"/>
-              </w:rPr>
-              <w:t>[Date]</w:t>
+            <w:r>
+              <w:t>Not provided</w:t>
             </w:r>
           </w:p>
         </w:tc>
@@ -2974,21 +2834,8 @@
             <w:tcW w:w="1600" w:type="dxa"/>
           </w:tcPr>
           <w:p>
-            <w:pPr>
-              <w:spacing w:line="260" w:lineRule="auto"/>
-              <w:rPr>
-                <w:rFonts w:ascii="Times New Roman" w:hAnsi="Times New Roman" w:cs="Times New Roman"/>
-                <w:sz w:val="24"/>
-                <w:szCs w:val="24"/>
-              </w:rPr>
-            </w:pPr>
-            <w:r>
-              <w:rPr>
-                <w:rFonts w:ascii="Times New Roman" w:hAnsi="Times New Roman" w:cs="Times New Roman"/>
-                <w:sz w:val="24"/>
-                <w:szCs w:val="24"/>
-              </w:rPr>
-              <w:t>[Name]</w:t>
+            <w:r>
+              <w:t>Owner B</w:t>
             </w:r>
           </w:p>
         </w:tc>
@@ -2997,21 +2844,8 @@
             <w:tcW w:w="1200" w:type="dxa"/>
           </w:tcPr>
           <w:p>
-            <w:pPr>
-              <w:spacing w:line="260" w:lineRule="auto"/>
-              <w:rPr>
-                <w:rFonts w:ascii="Times New Roman" w:hAnsi="Times New Roman" w:cs="Times New Roman"/>
-                <w:sz w:val="24"/>
-                <w:szCs w:val="24"/>
-              </w:rPr>
-            </w:pPr>
-            <w:r>
-              <w:rPr>
-                <w:rFonts w:ascii="Times New Roman" w:hAnsi="Times New Roman" w:cs="Times New Roman"/>
-                <w:sz w:val="24"/>
-                <w:szCs w:val="24"/>
-              </w:rPr>
-              <w:t>[Date]</w:t>
+            <w:r>
+              <w:t>Not provided</w:t>
             </w:r>
           </w:p>
         </w:tc>
@@ -3068,21 +2902,8 @@
             <w:tcW w:w="1600" w:type="dxa"/>
           </w:tcPr>
           <w:p>
-            <w:pPr>
-              <w:spacing w:line="260" w:lineRule="auto"/>
-              <w:rPr>
-                <w:rFonts w:ascii="Times New Roman" w:hAnsi="Times New Roman" w:cs="Times New Roman"/>
-                <w:sz w:val="24"/>
-                <w:szCs w:val="24"/>
-              </w:rPr>
-            </w:pPr>
-            <w:r>
-              <w:rPr>
-                <w:rFonts w:ascii="Times New Roman" w:hAnsi="Times New Roman" w:cs="Times New Roman"/>
-                <w:sz w:val="24"/>
-                <w:szCs w:val="24"/>
-              </w:rPr>
-              <w:t>[Name]</w:t>
+            <w:r>
+              <w:t>Owner B</w:t>
             </w:r>
           </w:p>
         </w:tc>
@@ -3091,21 +2912,8 @@
             <w:tcW w:w="1200" w:type="dxa"/>
           </w:tcPr>
           <w:p>
-            <w:pPr>
-              <w:spacing w:line="260" w:lineRule="auto"/>
-              <w:rPr>
-                <w:rFonts w:ascii="Times New Roman" w:hAnsi="Times New Roman" w:cs="Times New Roman"/>
-                <w:sz w:val="24"/>
-                <w:szCs w:val="24"/>
-              </w:rPr>
-            </w:pPr>
-            <w:r>
-              <w:rPr>
-                <w:rFonts w:ascii="Times New Roman" w:hAnsi="Times New Roman" w:cs="Times New Roman"/>
-                <w:sz w:val="24"/>
-                <w:szCs w:val="24"/>
-              </w:rPr>
-              <w:t>[Date]</w:t>
+            <w:r>
+              <w:t>Not provided</w:t>
             </w:r>
           </w:p>
         </w:tc>
@@ -3162,21 +2970,8 @@
             <w:tcW w:w="1600" w:type="dxa"/>
           </w:tcPr>
           <w:p>
-            <w:pPr>
-              <w:spacing w:line="260" w:lineRule="auto"/>
-              <w:rPr>
-                <w:rFonts w:ascii="Times New Roman" w:hAnsi="Times New Roman" w:cs="Times New Roman"/>
-                <w:sz w:val="24"/>
-                <w:szCs w:val="24"/>
-              </w:rPr>
-            </w:pPr>
-            <w:r>
-              <w:rPr>
-                <w:rFonts w:ascii="Times New Roman" w:hAnsi="Times New Roman" w:cs="Times New Roman"/>
-                <w:sz w:val="24"/>
-                <w:szCs w:val="24"/>
-              </w:rPr>
-              <w:t>[Names]</w:t>
+            <w:r>
+              <w:t>Owners A and B</w:t>
             </w:r>
           </w:p>
         </w:tc>
@@ -3185,21 +2980,8 @@
             <w:tcW w:w="1200" w:type="dxa"/>
           </w:tcPr>
           <w:p>
-            <w:pPr>
-              <w:spacing w:line="260" w:lineRule="auto"/>
-              <w:rPr>
-                <w:rFonts w:ascii="Times New Roman" w:hAnsi="Times New Roman" w:cs="Times New Roman"/>
-                <w:sz w:val="24"/>
-                <w:szCs w:val="24"/>
-              </w:rPr>
-            </w:pPr>
-            <w:r>
-              <w:rPr>
-                <w:rFonts w:ascii="Times New Roman" w:hAnsi="Times New Roman" w:cs="Times New Roman"/>
-                <w:sz w:val="24"/>
-                <w:szCs w:val="24"/>
-              </w:rPr>
-              <w:t>[Date]</w:t>
+            <w:r>
+              <w:t>Not provided</w:t>
             </w:r>
           </w:p>
         </w:tc>
@@ -3225,13 +3007,7 @@
         </w:rPr>
       </w:pPr>
       <w:r>
-        <w:rPr>
-          <w:rFonts w:ascii="Times New Roman" w:hAnsi="Times New Roman" w:cs="Times New Roman"/>
-          <w:sz w:val="24"/>
-          <w:szCs w:val="24"/>
-        </w:rPr>
-        <w:lastRenderedPageBreak/>
-        <w:t>The main schedule risk is the chunker. Phase 1 should be completed before other phases depend on it.</w:t>
+        <w:t>The chunker and Owner B core implementation are present. E1/E2 calibration and E3/E4 simulation runs remain dependent on generated benchmark inputs and the exported E1 topology; team-member names and target dates were not provided.</w:t>
       </w:r>
     </w:p>
     <w:p>
@@ -3557,21 +3333,8 @@
             <w:tcW w:w="4560" w:type="dxa"/>
           </w:tcPr>
           <w:p>
-            <w:pPr>
-              <w:spacing w:line="260" w:lineRule="auto"/>
-              <w:rPr>
-                <w:rFonts w:ascii="Times New Roman" w:hAnsi="Times New Roman" w:cs="Times New Roman"/>
-                <w:sz w:val="24"/>
-                <w:szCs w:val="24"/>
-              </w:rPr>
-            </w:pPr>
-            <w:r>
-              <w:rPr>
-                <w:rFonts w:ascii="Times New Roman" w:hAnsi="Times New Roman" w:cs="Times New Roman"/>
-                <w:sz w:val="24"/>
-                <w:szCs w:val="24"/>
-              </w:rPr>
-              <w:t>Replication, cache, durable write path, index rebuild procedure</w:t>
+            <w:r>
+              <w:t>Production mitigations include replication, caching, a durable write path, and index rebuild tooling. E3 models a circuit breaker, but its ChunkWise-specific run has not yet been executed.</w:t>
             </w:r>
           </w:p>
         </w:tc>
@@ -3856,6 +3619,70 @@
                 <w:szCs w:val="24"/>
               </w:rPr>
               <w:t>Boundary-stability tests (insertion must not shift later boundaries)</w:t>
+            </w:r>
+          </w:p>
+        </w:tc>
+      </w:tr>
+      <w:tr>
+        <w:tc>
+          <w:tcPr>
+            <w:tcW w:type="dxa" w:w="2600"/>
+          </w:tcPr>
+          <w:p>
+            <w:r>
+              <w:t>Retries amplify an index slowdown</w:t>
+            </w:r>
+          </w:p>
+        </w:tc>
+        <w:tc>
+          <w:tcPr>
+            <w:tcW w:type="dxa" w:w="2200"/>
+          </w:tcPr>
+          <w:p>
+            <w:r>
+              <w:t>Upload goodput may collapse while index load and queueing rise</w:t>
+            </w:r>
+          </w:p>
+        </w:tc>
+        <w:tc>
+          <w:tcPr>
+            <w:tcW w:type="dxa" w:w="4560"/>
+          </w:tcPr>
+          <w:p>
+            <w:r>
+              <w:t>Bound retries and use a circuit breaker; E3 is specified but awaits the E1 design and calibrated inputs</w:t>
+            </w:r>
+          </w:p>
+        </w:tc>
+      </w:tr>
+      <w:tr>
+        <w:tc>
+          <w:tcPr>
+            <w:tcW w:type="dxa" w:w="2600"/>
+          </w:tcPr>
+          <w:p>
+            <w:r>
+              <w:t>Restore traffic competes with uploads</w:t>
+            </w:r>
+          </w:p>
+        </w:tc>
+        <w:tc>
+          <w:tcPr>
+            <w:tcW w:type="dxa" w:w="2200"/>
+          </w:tcPr>
+          <w:p>
+            <w:r>
+              <w:t>Shared gateway, index, and chunk store may increase upload tail latency</w:t>
+            </w:r>
+          </w:p>
+        </w:tc>
+        <w:tc>
+          <w:tcPr>
+            <w:tcW w:type="dxa" w:w="4560"/>
+          </w:tcPr>
+          <w:p>
+            <w:r>
+              <w:t>Measure the E4 restore-load sweep before deciding whether to isolate restore capacity</w:t>
             </w:r>
           </w:p>
         </w:tc>
@@ -4137,6 +3964,11 @@
           <w:szCs w:val="24"/>
         </w:rPr>
         <w:t>Throughput is measured end to end, from request to committed write and from request to fully reconstructed file.</w:t>
+      </w:r>
+    </w:p>
+    <w:p>
+      <w:r>
+        <w:t>Breakscale E3/E4 results are pending. This checkout contains no exported E1 design, results/breakscale_params.json, results/results.json, or three-seed E1 sweep from which to select the knee. Figures 5–8 and Table 7 are therefore not populated; no capacity result is claimed.</w:t>
       </w:r>
     </w:p>
     <w:p>

</xml_diff>